<commit_message>
analyzing first EA results
</commit_message>
<xml_diff>
--- a/data/first_ea/replays/report_first_ea.docx
+++ b/data/first_ea/replays/report_first_ea.docx
@@ -341,7 +341,7 @@
         <w:br/>
         <w:t xml:space="preserve">   • Post-hoc Pairwise Test: Pairwise log-rank tests (all group pairs compared)</w:t>
         <w:br/>
-        <w:t xml:space="preserve">   • Multiple Comparisons Correction: Holm–Bonferroni (sequential adjustment of p-value thresholds)</w:t>
+        <w:t xml:space="preserve">   • Multiple Comparisons Correction: Holm-Bonferroni (sequential adjustment of p-value thresholds)</w:t>
         <w:br/>
         <w:t xml:space="preserve">   • Post-hoc Effect Size: χ² per pair (interpretation depends on degrees of freedom and sample sizes)</w:t>
         <w:br/>
@@ -3730,6 +3730,260 @@
                     <a:xfrm>
                       <a:off x="0" y="0"/>
                       <a:ext cx="5943600" cy="2940398"/>
+                    </a:xfrm>
+                    <a:prstGeom prst="rect"/>
+                  </pic:spPr>
+                </pic:pic>
+              </a:graphicData>
+            </a:graphic>
+          </wp:inline>
+        </w:drawing>
+      </w:r>
+    </w:p>
+    <w:p/>
+    <w:p>
+      <w:pPr>
+        <w:pStyle w:val="Heading1"/>
+      </w:pPr>
+      <w:r>
+        <w:t>3. Genomes</w:t>
+      </w:r>
+    </w:p>
+    <w:p>
+      <w:pPr>
+        <w:pStyle w:val="Heading2"/>
+      </w:pPr>
+      <w:r>
+        <w:t>3.1. Wiring</w:t>
+      </w:r>
+    </w:p>
+    <w:p>
+      <w:pPr>
+        <w:pStyle w:val="Heading3"/>
+      </w:pPr>
+      <w:r>
+        <w:t>Effective Connection Strength (weight_initial × reliability)</w:t>
+      </w:r>
+    </w:p>
+    <w:p>
+      <w:r>
+        <w:drawing>
+          <wp:inline xmlns:a="http://schemas.openxmlformats.org/drawingml/2006/main" xmlns:pic="http://schemas.openxmlformats.org/drawingml/2006/picture">
+            <wp:extent cx="5943600" cy="5203061"/>
+            <wp:docPr id="6" name="Picture 6"/>
+            <wp:cNvGraphicFramePr>
+              <a:graphicFrameLocks noChangeAspect="1"/>
+            </wp:cNvGraphicFramePr>
+            <a:graphic>
+              <a:graphicData uri="http://schemas.openxmlformats.org/drawingml/2006/picture">
+                <pic:pic>
+                  <pic:nvPicPr>
+                    <pic:cNvPr id="0" name="network_effective_EA_from_Random.png"/>
+                    <pic:cNvPicPr/>
+                  </pic:nvPicPr>
+                  <pic:blipFill>
+                    <a:blip r:embed="rId14"/>
+                    <a:stretch>
+                      <a:fillRect/>
+                    </a:stretch>
+                  </pic:blipFill>
+                  <pic:spPr>
+                    <a:xfrm>
+                      <a:off x="0" y="0"/>
+                      <a:ext cx="5943600" cy="5203061"/>
+                    </a:xfrm>
+                    <a:prstGeom prst="rect"/>
+                  </pic:spPr>
+                </pic:pic>
+              </a:graphicData>
+            </a:graphic>
+          </wp:inline>
+        </w:drawing>
+      </w:r>
+    </w:p>
+    <w:p/>
+    <w:p>
+      <w:r>
+        <w:drawing>
+          <wp:inline xmlns:a="http://schemas.openxmlformats.org/drawingml/2006/main" xmlns:pic="http://schemas.openxmlformats.org/drawingml/2006/picture">
+            <wp:extent cx="5943600" cy="5203061"/>
+            <wp:docPr id="7" name="Picture 7"/>
+            <wp:cNvGraphicFramePr>
+              <a:graphicFrameLocks noChangeAspect="1"/>
+            </wp:cNvGraphicFramePr>
+            <a:graphic>
+              <a:graphicData uri="http://schemas.openxmlformats.org/drawingml/2006/picture">
+                <pic:pic>
+                  <pic:nvPicPr>
+                    <pic:cNvPr id="0" name="network_effective_EA_from_Soft-Coded.png"/>
+                    <pic:cNvPicPr/>
+                  </pic:nvPicPr>
+                  <pic:blipFill>
+                    <a:blip r:embed="rId15"/>
+                    <a:stretch>
+                      <a:fillRect/>
+                    </a:stretch>
+                  </pic:blipFill>
+                  <pic:spPr>
+                    <a:xfrm>
+                      <a:off x="0" y="0"/>
+                      <a:ext cx="5943600" cy="5203061"/>
+                    </a:xfrm>
+                    <a:prstGeom prst="rect"/>
+                  </pic:spPr>
+                </pic:pic>
+              </a:graphicData>
+            </a:graphic>
+          </wp:inline>
+        </w:drawing>
+      </w:r>
+    </w:p>
+    <w:p/>
+    <w:p>
+      <w:r>
+        <w:drawing>
+          <wp:inline xmlns:a="http://schemas.openxmlformats.org/drawingml/2006/main" xmlns:pic="http://schemas.openxmlformats.org/drawingml/2006/picture">
+            <wp:extent cx="5943600" cy="5203061"/>
+            <wp:docPr id="8" name="Picture 8"/>
+            <wp:cNvGraphicFramePr>
+              <a:graphicFrameLocks noChangeAspect="1"/>
+            </wp:cNvGraphicFramePr>
+            <a:graphic>
+              <a:graphicData uri="http://schemas.openxmlformats.org/drawingml/2006/picture">
+                <pic:pic>
+                  <pic:nvPicPr>
+                    <pic:cNvPr id="0" name="network_effective_Soft-Coded.png"/>
+                    <pic:cNvPicPr/>
+                  </pic:nvPicPr>
+                  <pic:blipFill>
+                    <a:blip r:embed="rId16"/>
+                    <a:stretch>
+                      <a:fillRect/>
+                    </a:stretch>
+                  </pic:blipFill>
+                  <pic:spPr>
+                    <a:xfrm>
+                      <a:off x="0" y="0"/>
+                      <a:ext cx="5943600" cy="5203061"/>
+                    </a:xfrm>
+                    <a:prstGeom prst="rect"/>
+                  </pic:spPr>
+                </pic:pic>
+              </a:graphicData>
+            </a:graphic>
+          </wp:inline>
+        </w:drawing>
+      </w:r>
+    </w:p>
+    <w:p/>
+    <w:p>
+      <w:pPr>
+        <w:pStyle w:val="Heading3"/>
+      </w:pPr>
+      <w:r>
+        <w:t>Raw Initial Weights (weight_initial)</w:t>
+      </w:r>
+    </w:p>
+    <w:p>
+      <w:r>
+        <w:drawing>
+          <wp:inline xmlns:a="http://schemas.openxmlformats.org/drawingml/2006/main" xmlns:pic="http://schemas.openxmlformats.org/drawingml/2006/picture">
+            <wp:extent cx="5943600" cy="5203061"/>
+            <wp:docPr id="9" name="Picture 9"/>
+            <wp:cNvGraphicFramePr>
+              <a:graphicFrameLocks noChangeAspect="1"/>
+            </wp:cNvGraphicFramePr>
+            <a:graphic>
+              <a:graphicData uri="http://schemas.openxmlformats.org/drawingml/2006/picture">
+                <pic:pic>
+                  <pic:nvPicPr>
+                    <pic:cNvPr id="0" name="network_raw_EA_from_Random.png"/>
+                    <pic:cNvPicPr/>
+                  </pic:nvPicPr>
+                  <pic:blipFill>
+                    <a:blip r:embed="rId17"/>
+                    <a:stretch>
+                      <a:fillRect/>
+                    </a:stretch>
+                  </pic:blipFill>
+                  <pic:spPr>
+                    <a:xfrm>
+                      <a:off x="0" y="0"/>
+                      <a:ext cx="5943600" cy="5203061"/>
+                    </a:xfrm>
+                    <a:prstGeom prst="rect"/>
+                  </pic:spPr>
+                </pic:pic>
+              </a:graphicData>
+            </a:graphic>
+          </wp:inline>
+        </w:drawing>
+      </w:r>
+    </w:p>
+    <w:p/>
+    <w:p>
+      <w:r>
+        <w:drawing>
+          <wp:inline xmlns:a="http://schemas.openxmlformats.org/drawingml/2006/main" xmlns:pic="http://schemas.openxmlformats.org/drawingml/2006/picture">
+            <wp:extent cx="5943600" cy="5203061"/>
+            <wp:docPr id="10" name="Picture 10"/>
+            <wp:cNvGraphicFramePr>
+              <a:graphicFrameLocks noChangeAspect="1"/>
+            </wp:cNvGraphicFramePr>
+            <a:graphic>
+              <a:graphicData uri="http://schemas.openxmlformats.org/drawingml/2006/picture">
+                <pic:pic>
+                  <pic:nvPicPr>
+                    <pic:cNvPr id="0" name="network_raw_EA_from_Soft-Coded.png"/>
+                    <pic:cNvPicPr/>
+                  </pic:nvPicPr>
+                  <pic:blipFill>
+                    <a:blip r:embed="rId18"/>
+                    <a:stretch>
+                      <a:fillRect/>
+                    </a:stretch>
+                  </pic:blipFill>
+                  <pic:spPr>
+                    <a:xfrm>
+                      <a:off x="0" y="0"/>
+                      <a:ext cx="5943600" cy="5203061"/>
+                    </a:xfrm>
+                    <a:prstGeom prst="rect"/>
+                  </pic:spPr>
+                </pic:pic>
+              </a:graphicData>
+            </a:graphic>
+          </wp:inline>
+        </w:drawing>
+      </w:r>
+    </w:p>
+    <w:p/>
+    <w:p>
+      <w:r>
+        <w:drawing>
+          <wp:inline xmlns:a="http://schemas.openxmlformats.org/drawingml/2006/main" xmlns:pic="http://schemas.openxmlformats.org/drawingml/2006/picture">
+            <wp:extent cx="5943600" cy="5203061"/>
+            <wp:docPr id="11" name="Picture 11"/>
+            <wp:cNvGraphicFramePr>
+              <a:graphicFrameLocks noChangeAspect="1"/>
+            </wp:cNvGraphicFramePr>
+            <a:graphic>
+              <a:graphicData uri="http://schemas.openxmlformats.org/drawingml/2006/picture">
+                <pic:pic>
+                  <pic:nvPicPr>
+                    <pic:cNvPr id="0" name="network_effective_Soft-Coded.png"/>
+                    <pic:cNvPicPr/>
+                  </pic:nvPicPr>
+                  <pic:blipFill>
+                    <a:blip r:embed="rId16"/>
+                    <a:stretch>
+                      <a:fillRect/>
+                    </a:stretch>
+                  </pic:blipFill>
+                  <pic:spPr>
+                    <a:xfrm>
+                      <a:off x="0" y="0"/>
+                      <a:ext cx="5943600" cy="5203061"/>
                     </a:xfrm>
                     <a:prstGeom prst="rect"/>
                   </pic:spPr>

</xml_diff>

<commit_message>
analysis of ea results
</commit_message>
<xml_diff>
--- a/data/first_ea/replays/report_first_ea.docx
+++ b/data/first_ea/replays/report_first_ea.docx
@@ -318,7 +318,7 @@
         <w:t>Normality is assessed using the Shapiro-Wilk test (alpha = 0.05) for each group independently. If any group fails the normality test, the analysis uses non-parametric methods.</w:t>
         <w:br/>
         <w:br/>
-        <w:t>PER-TICK METRICS (TEMPORAL ANALYSIS)</w:t>
+        <w:t>TIME SERIES</w:t>
         <w:br/>
         <w:br/>
         <w:t>For metrics tracked per simulation tick (e.g., energy), per-tick data are analyzed using the Area Under the Curve (AUC) method:</w:t>
@@ -330,6 +330,14 @@
         <w:t xml:space="preserve">   • This approach is conservative and avoids temporal autocorrelation issues by summarizing the time-series into a single magnitude metric</w:t>
         <w:br/>
         <w:t xml:space="preserve">   • Visualizations show individual run curves (low opacity) overlaid with group mean curves (bold) and 95% confidence bands (shaded)</w:t>
+        <w:br/>
+        <w:br/>
+        <w:t>DISTRIBUTIONS</w:t>
+        <w:br/>
+        <w:br/>
+        <w:t xml:space="preserve">Distrinutions are compared using the Kolmogorov-Smirnov (KS) test: with Holm-Bonferroni post hoc corrections, </w:t>
+        <w:br/>
+        <w:t>and effect size measured by the KS D statistic (interpreted as small ≥ 0.1, medium ≥ 0.3, large ≥ 0.5).</w:t>
         <w:br/>
         <w:br/>
         <w:t>SURVIVAL CURVES</w:t>
@@ -3994,6 +4002,1719 @@
         </w:drawing>
       </w:r>
     </w:p>
+    <w:p/>
+    <w:p>
+      <w:r>
+        <w:drawing>
+          <wp:inline xmlns:a="http://schemas.openxmlformats.org/drawingml/2006/main" xmlns:pic="http://schemas.openxmlformats.org/drawingml/2006/picture">
+            <wp:extent cx="5943600" cy="3529263"/>
+            <wp:docPr id="12" name="Picture 12"/>
+            <wp:cNvGraphicFramePr>
+              <a:graphicFrameLocks noChangeAspect="1"/>
+            </wp:cNvGraphicFramePr>
+            <a:graphic>
+              <a:graphicData uri="http://schemas.openxmlformats.org/drawingml/2006/picture">
+                <pic:pic>
+                  <pic:nvPicPr>
+                    <pic:cNvPr id="0" name="distribution_weight_effective.png"/>
+                    <pic:cNvPicPr/>
+                  </pic:nvPicPr>
+                  <pic:blipFill>
+                    <a:blip r:embed="rId19"/>
+                    <a:stretch>
+                      <a:fillRect/>
+                    </a:stretch>
+                  </pic:blipFill>
+                  <pic:spPr>
+                    <a:xfrm>
+                      <a:off x="0" y="0"/>
+                      <a:ext cx="5943600" cy="3529263"/>
+                    </a:xfrm>
+                    <a:prstGeom prst="rect"/>
+                  </pic:spPr>
+                </pic:pic>
+              </a:graphicData>
+            </a:graphic>
+          </wp:inline>
+        </w:drawing>
+      </w:r>
+    </w:p>
+    <w:p/>
+    <w:p>
+      <w:pPr>
+        <w:pStyle w:val="Heading3"/>
+      </w:pPr>
+      <w:r>
+        <w:t>Distribution Comparison (Pairwise KS tests, Holm-Bonferroni corrected)</w:t>
+      </w:r>
+    </w:p>
+    <w:tbl>
+      <w:tblPr>
+        <w:tblStyle w:val="LightGrid-Accent1"/>
+        <w:tblW w:type="auto" w:w="0"/>
+        <w:tblLook w:firstColumn="1" w:firstRow="1" w:lastColumn="0" w:lastRow="0" w:noHBand="0" w:noVBand="1" w:val="04A0"/>
+      </w:tblPr>
+      <w:tblGrid>
+        <w:gridCol w:w="1440"/>
+        <w:gridCol w:w="1440"/>
+        <w:gridCol w:w="1440"/>
+        <w:gridCol w:w="1440"/>
+        <w:gridCol w:w="1440"/>
+        <w:gridCol w:w="1440"/>
+      </w:tblGrid>
+      <w:tr>
+        <w:tc>
+          <w:tcPr>
+            <w:tcW w:type="dxa" w:w="1440"/>
+          </w:tcPr>
+          <w:p>
+            <w:r>
+              <w:t>Group A</w:t>
+            </w:r>
+          </w:p>
+        </w:tc>
+        <w:tc>
+          <w:tcPr>
+            <w:tcW w:type="dxa" w:w="1440"/>
+          </w:tcPr>
+          <w:p>
+            <w:r>
+              <w:t>Group B</w:t>
+            </w:r>
+          </w:p>
+        </w:tc>
+        <w:tc>
+          <w:tcPr>
+            <w:tcW w:type="dxa" w:w="1440"/>
+          </w:tcPr>
+          <w:p>
+            <w:r>
+              <w:t>D (effect size)</w:t>
+            </w:r>
+          </w:p>
+        </w:tc>
+        <w:tc>
+          <w:tcPr>
+            <w:tcW w:type="dxa" w:w="1440"/>
+          </w:tcPr>
+          <w:p>
+            <w:r>
+              <w:t>Effect magnitude</w:t>
+            </w:r>
+          </w:p>
+        </w:tc>
+        <w:tc>
+          <w:tcPr>
+            <w:tcW w:type="dxa" w:w="1440"/>
+          </w:tcPr>
+          <w:p>
+            <w:r>
+              <w:t>p (raw)</w:t>
+            </w:r>
+          </w:p>
+        </w:tc>
+        <w:tc>
+          <w:tcPr>
+            <w:tcW w:type="dxa" w:w="1440"/>
+          </w:tcPr>
+          <w:p>
+            <w:r>
+              <w:t>p (corrected)</w:t>
+            </w:r>
+          </w:p>
+        </w:tc>
+      </w:tr>
+      <w:tr>
+        <w:tc>
+          <w:tcPr>
+            <w:tcW w:type="dxa" w:w="1440"/>
+          </w:tcPr>
+          <w:p>
+            <w:r>
+              <w:t>EA from Random</w:t>
+            </w:r>
+          </w:p>
+        </w:tc>
+        <w:tc>
+          <w:tcPr>
+            <w:tcW w:type="dxa" w:w="1440"/>
+          </w:tcPr>
+          <w:p>
+            <w:r>
+              <w:t>EA from Soft-Coded</w:t>
+            </w:r>
+          </w:p>
+        </w:tc>
+        <w:tc>
+          <w:tcPr>
+            <w:tcW w:type="dxa" w:w="1440"/>
+          </w:tcPr>
+          <w:p>
+            <w:r>
+              <w:t>0.4891</w:t>
+            </w:r>
+          </w:p>
+        </w:tc>
+        <w:tc>
+          <w:tcPr>
+            <w:tcW w:type="dxa" w:w="1440"/>
+          </w:tcPr>
+          <w:p>
+            <w:r>
+              <w:t>medium</w:t>
+            </w:r>
+          </w:p>
+        </w:tc>
+        <w:tc>
+          <w:tcPr>
+            <w:tcW w:type="dxa" w:w="1440"/>
+          </w:tcPr>
+          <w:p>
+            <w:r>
+              <w:t>1.29 × 10⁻²⁴</w:t>
+            </w:r>
+          </w:p>
+        </w:tc>
+        <w:tc>
+          <w:tcPr>
+            <w:tcW w:type="dxa" w:w="1440"/>
+          </w:tcPr>
+          <w:p>
+            <w:r>
+              <w:t>3.87 × 10⁻²⁴ *</w:t>
+            </w:r>
+          </w:p>
+        </w:tc>
+      </w:tr>
+      <w:tr>
+        <w:tc>
+          <w:tcPr>
+            <w:tcW w:type="dxa" w:w="1440"/>
+          </w:tcPr>
+          <w:p>
+            <w:r>
+              <w:t>EA from Random</w:t>
+            </w:r>
+          </w:p>
+        </w:tc>
+        <w:tc>
+          <w:tcPr>
+            <w:tcW w:type="dxa" w:w="1440"/>
+          </w:tcPr>
+          <w:p>
+            <w:r>
+              <w:t>Soft-Coded</w:t>
+            </w:r>
+          </w:p>
+        </w:tc>
+        <w:tc>
+          <w:tcPr>
+            <w:tcW w:type="dxa" w:w="1440"/>
+          </w:tcPr>
+          <w:p>
+            <w:r>
+              <w:t>0.6784</w:t>
+            </w:r>
+          </w:p>
+        </w:tc>
+        <w:tc>
+          <w:tcPr>
+            <w:tcW w:type="dxa" w:w="1440"/>
+          </w:tcPr>
+          <w:p>
+            <w:r>
+              <w:t>large</w:t>
+            </w:r>
+          </w:p>
+        </w:tc>
+        <w:tc>
+          <w:tcPr>
+            <w:tcW w:type="dxa" w:w="1440"/>
+          </w:tcPr>
+          <w:p>
+            <w:r>
+              <w:t>2.47 × 10⁻⁶</w:t>
+            </w:r>
+          </w:p>
+        </w:tc>
+        <w:tc>
+          <w:tcPr>
+            <w:tcW w:type="dxa" w:w="1440"/>
+          </w:tcPr>
+          <w:p>
+            <w:r>
+              <w:t>4.95 × 10⁻⁶ *</w:t>
+            </w:r>
+          </w:p>
+        </w:tc>
+      </w:tr>
+      <w:tr>
+        <w:tc>
+          <w:tcPr>
+            <w:tcW w:type="dxa" w:w="1440"/>
+          </w:tcPr>
+          <w:p>
+            <w:r>
+              <w:t>EA from Soft-Coded</w:t>
+            </w:r>
+          </w:p>
+        </w:tc>
+        <w:tc>
+          <w:tcPr>
+            <w:tcW w:type="dxa" w:w="1440"/>
+          </w:tcPr>
+          <w:p>
+            <w:r>
+              <w:t>Soft-Coded</w:t>
+            </w:r>
+          </w:p>
+        </w:tc>
+        <w:tc>
+          <w:tcPr>
+            <w:tcW w:type="dxa" w:w="1440"/>
+          </w:tcPr>
+          <w:p>
+            <w:r>
+              <w:t>0.4615</w:t>
+            </w:r>
+          </w:p>
+        </w:tc>
+        <w:tc>
+          <w:tcPr>
+            <w:tcW w:type="dxa" w:w="1440"/>
+          </w:tcPr>
+          <w:p>
+            <w:r>
+              <w:t>medium</w:t>
+            </w:r>
+          </w:p>
+        </w:tc>
+        <w:tc>
+          <w:tcPr>
+            <w:tcW w:type="dxa" w:w="1440"/>
+          </w:tcPr>
+          <w:p>
+            <w:r>
+              <w:t>0.0087</w:t>
+            </w:r>
+          </w:p>
+        </w:tc>
+        <w:tc>
+          <w:tcPr>
+            <w:tcW w:type="dxa" w:w="1440"/>
+          </w:tcPr>
+          <w:p>
+            <w:r>
+              <w:t>0.0087 *</w:t>
+            </w:r>
+          </w:p>
+        </w:tc>
+      </w:tr>
+    </w:tbl>
+    <w:p/>
+    <w:p>
+      <w:pPr>
+        <w:pStyle w:val="Heading3"/>
+      </w:pPr>
+      <w:r>
+        <w:t>Per-Variant Distributions</w:t>
+      </w:r>
+    </w:p>
+    <w:p>
+      <w:r>
+        <w:drawing>
+          <wp:inline xmlns:a="http://schemas.openxmlformats.org/drawingml/2006/main" xmlns:pic="http://schemas.openxmlformats.org/drawingml/2006/picture">
+            <wp:extent cx="5943600" cy="3529263"/>
+            <wp:docPr id="13" name="Picture 13"/>
+            <wp:cNvGraphicFramePr>
+              <a:graphicFrameLocks noChangeAspect="1"/>
+            </wp:cNvGraphicFramePr>
+            <a:graphic>
+              <a:graphicData uri="http://schemas.openxmlformats.org/drawingml/2006/picture">
+                <pic:pic>
+                  <pic:nvPicPr>
+                    <pic:cNvPr id="0" name="distribution_variants_weight_effective.png"/>
+                    <pic:cNvPicPr/>
+                  </pic:nvPicPr>
+                  <pic:blipFill>
+                    <a:blip r:embed="rId20"/>
+                    <a:stretch>
+                      <a:fillRect/>
+                    </a:stretch>
+                  </pic:blipFill>
+                  <pic:spPr>
+                    <a:xfrm>
+                      <a:off x="0" y="0"/>
+                      <a:ext cx="5943600" cy="3529263"/>
+                    </a:xfrm>
+                    <a:prstGeom prst="rect"/>
+                  </pic:spPr>
+                </pic:pic>
+              </a:graphicData>
+            </a:graphic>
+          </wp:inline>
+        </w:drawing>
+      </w:r>
+    </w:p>
+    <w:p/>
+    <w:p>
+      <w:r>
+        <w:drawing>
+          <wp:inline xmlns:a="http://schemas.openxmlformats.org/drawingml/2006/main" xmlns:pic="http://schemas.openxmlformats.org/drawingml/2006/picture">
+            <wp:extent cx="5943600" cy="3529263"/>
+            <wp:docPr id="14" name="Picture 14"/>
+            <wp:cNvGraphicFramePr>
+              <a:graphicFrameLocks noChangeAspect="1"/>
+            </wp:cNvGraphicFramePr>
+            <a:graphic>
+              <a:graphicData uri="http://schemas.openxmlformats.org/drawingml/2006/picture">
+                <pic:pic>
+                  <pic:nvPicPr>
+                    <pic:cNvPr id="0" name="distribution_weight_initial.png"/>
+                    <pic:cNvPicPr/>
+                  </pic:nvPicPr>
+                  <pic:blipFill>
+                    <a:blip r:embed="rId21"/>
+                    <a:stretch>
+                      <a:fillRect/>
+                    </a:stretch>
+                  </pic:blipFill>
+                  <pic:spPr>
+                    <a:xfrm>
+                      <a:off x="0" y="0"/>
+                      <a:ext cx="5943600" cy="3529263"/>
+                    </a:xfrm>
+                    <a:prstGeom prst="rect"/>
+                  </pic:spPr>
+                </pic:pic>
+              </a:graphicData>
+            </a:graphic>
+          </wp:inline>
+        </w:drawing>
+      </w:r>
+    </w:p>
+    <w:p/>
+    <w:p>
+      <w:pPr>
+        <w:pStyle w:val="Heading3"/>
+      </w:pPr>
+      <w:r>
+        <w:t>Distribution Comparison (Pairwise KS tests, Holm-Bonferroni corrected)</w:t>
+      </w:r>
+    </w:p>
+    <w:tbl>
+      <w:tblPr>
+        <w:tblStyle w:val="LightGrid-Accent1"/>
+        <w:tblW w:type="auto" w:w="0"/>
+        <w:tblLook w:firstColumn="1" w:firstRow="1" w:lastColumn="0" w:lastRow="0" w:noHBand="0" w:noVBand="1" w:val="04A0"/>
+      </w:tblPr>
+      <w:tblGrid>
+        <w:gridCol w:w="1440"/>
+        <w:gridCol w:w="1440"/>
+        <w:gridCol w:w="1440"/>
+        <w:gridCol w:w="1440"/>
+        <w:gridCol w:w="1440"/>
+        <w:gridCol w:w="1440"/>
+      </w:tblGrid>
+      <w:tr>
+        <w:tc>
+          <w:tcPr>
+            <w:tcW w:type="dxa" w:w="1440"/>
+          </w:tcPr>
+          <w:p>
+            <w:r>
+              <w:t>Group A</w:t>
+            </w:r>
+          </w:p>
+        </w:tc>
+        <w:tc>
+          <w:tcPr>
+            <w:tcW w:type="dxa" w:w="1440"/>
+          </w:tcPr>
+          <w:p>
+            <w:r>
+              <w:t>Group B</w:t>
+            </w:r>
+          </w:p>
+        </w:tc>
+        <w:tc>
+          <w:tcPr>
+            <w:tcW w:type="dxa" w:w="1440"/>
+          </w:tcPr>
+          <w:p>
+            <w:r>
+              <w:t>D (effect size)</w:t>
+            </w:r>
+          </w:p>
+        </w:tc>
+        <w:tc>
+          <w:tcPr>
+            <w:tcW w:type="dxa" w:w="1440"/>
+          </w:tcPr>
+          <w:p>
+            <w:r>
+              <w:t>Effect magnitude</w:t>
+            </w:r>
+          </w:p>
+        </w:tc>
+        <w:tc>
+          <w:tcPr>
+            <w:tcW w:type="dxa" w:w="1440"/>
+          </w:tcPr>
+          <w:p>
+            <w:r>
+              <w:t>p (raw)</w:t>
+            </w:r>
+          </w:p>
+        </w:tc>
+        <w:tc>
+          <w:tcPr>
+            <w:tcW w:type="dxa" w:w="1440"/>
+          </w:tcPr>
+          <w:p>
+            <w:r>
+              <w:t>p (corrected)</w:t>
+            </w:r>
+          </w:p>
+        </w:tc>
+      </w:tr>
+      <w:tr>
+        <w:tc>
+          <w:tcPr>
+            <w:tcW w:type="dxa" w:w="1440"/>
+          </w:tcPr>
+          <w:p>
+            <w:r>
+              <w:t>EA from Random</w:t>
+            </w:r>
+          </w:p>
+        </w:tc>
+        <w:tc>
+          <w:tcPr>
+            <w:tcW w:type="dxa" w:w="1440"/>
+          </w:tcPr>
+          <w:p>
+            <w:r>
+              <w:t>EA from Soft-Coded</w:t>
+            </w:r>
+          </w:p>
+        </w:tc>
+        <w:tc>
+          <w:tcPr>
+            <w:tcW w:type="dxa" w:w="1440"/>
+          </w:tcPr>
+          <w:p>
+            <w:r>
+              <w:t>0.3857</w:t>
+            </w:r>
+          </w:p>
+        </w:tc>
+        <w:tc>
+          <w:tcPr>
+            <w:tcW w:type="dxa" w:w="1440"/>
+          </w:tcPr>
+          <w:p>
+            <w:r>
+              <w:t>medium</w:t>
+            </w:r>
+          </w:p>
+        </w:tc>
+        <w:tc>
+          <w:tcPr>
+            <w:tcW w:type="dxa" w:w="1440"/>
+          </w:tcPr>
+          <w:p>
+            <w:r>
+              <w:t>3.45 × 10⁻¹⁵</w:t>
+            </w:r>
+          </w:p>
+        </w:tc>
+        <w:tc>
+          <w:tcPr>
+            <w:tcW w:type="dxa" w:w="1440"/>
+          </w:tcPr>
+          <w:p>
+            <w:r>
+              <w:t>1.03 × 10⁻¹⁴ *</w:t>
+            </w:r>
+          </w:p>
+        </w:tc>
+      </w:tr>
+      <w:tr>
+        <w:tc>
+          <w:tcPr>
+            <w:tcW w:type="dxa" w:w="1440"/>
+          </w:tcPr>
+          <w:p>
+            <w:r>
+              <w:t>EA from Random</w:t>
+            </w:r>
+          </w:p>
+        </w:tc>
+        <w:tc>
+          <w:tcPr>
+            <w:tcW w:type="dxa" w:w="1440"/>
+          </w:tcPr>
+          <w:p>
+            <w:r>
+              <w:t>Soft-Coded</w:t>
+            </w:r>
+          </w:p>
+        </w:tc>
+        <w:tc>
+          <w:tcPr>
+            <w:tcW w:type="dxa" w:w="1440"/>
+          </w:tcPr>
+          <w:p>
+            <w:r>
+              <w:t>0.5590</w:t>
+            </w:r>
+          </w:p>
+        </w:tc>
+        <w:tc>
+          <w:tcPr>
+            <w:tcW w:type="dxa" w:w="1440"/>
+          </w:tcPr>
+          <w:p>
+            <w:r>
+              <w:t>large</w:t>
+            </w:r>
+          </w:p>
+        </w:tc>
+        <w:tc>
+          <w:tcPr>
+            <w:tcW w:type="dxa" w:w="1440"/>
+          </w:tcPr>
+          <w:p>
+            <w:r>
+              <w:t>2.78 × 10⁻⁴</w:t>
+            </w:r>
+          </w:p>
+        </w:tc>
+        <w:tc>
+          <w:tcPr>
+            <w:tcW w:type="dxa" w:w="1440"/>
+          </w:tcPr>
+          <w:p>
+            <w:r>
+              <w:t>5.57 × 10⁻⁴ *</w:t>
+            </w:r>
+          </w:p>
+        </w:tc>
+      </w:tr>
+      <w:tr>
+        <w:tc>
+          <w:tcPr>
+            <w:tcW w:type="dxa" w:w="1440"/>
+          </w:tcPr>
+          <w:p>
+            <w:r>
+              <w:t>EA from Soft-Coded</w:t>
+            </w:r>
+          </w:p>
+        </w:tc>
+        <w:tc>
+          <w:tcPr>
+            <w:tcW w:type="dxa" w:w="1440"/>
+          </w:tcPr>
+          <w:p>
+            <w:r>
+              <w:t>Soft-Coded</w:t>
+            </w:r>
+          </w:p>
+        </w:tc>
+        <w:tc>
+          <w:tcPr>
+            <w:tcW w:type="dxa" w:w="1440"/>
+          </w:tcPr>
+          <w:p>
+            <w:r>
+              <w:t>0.3077</w:t>
+            </w:r>
+          </w:p>
+        </w:tc>
+        <w:tc>
+          <w:tcPr>
+            <w:tcW w:type="dxa" w:w="1440"/>
+          </w:tcPr>
+          <w:p>
+            <w:r>
+              <w:t>medium</w:t>
+            </w:r>
+          </w:p>
+        </w:tc>
+        <w:tc>
+          <w:tcPr>
+            <w:tcW w:type="dxa" w:w="1440"/>
+          </w:tcPr>
+          <w:p>
+            <w:r>
+              <w:t>0.1800</w:t>
+            </w:r>
+          </w:p>
+        </w:tc>
+        <w:tc>
+          <w:tcPr>
+            <w:tcW w:type="dxa" w:w="1440"/>
+          </w:tcPr>
+          <w:p>
+            <w:r>
+              <w:t>0.1800</w:t>
+            </w:r>
+          </w:p>
+        </w:tc>
+      </w:tr>
+    </w:tbl>
+    <w:p/>
+    <w:p>
+      <w:pPr>
+        <w:pStyle w:val="Heading3"/>
+      </w:pPr>
+      <w:r>
+        <w:t>Per-Variant Distributions</w:t>
+      </w:r>
+    </w:p>
+    <w:p>
+      <w:r>
+        <w:drawing>
+          <wp:inline xmlns:a="http://schemas.openxmlformats.org/drawingml/2006/main" xmlns:pic="http://schemas.openxmlformats.org/drawingml/2006/picture">
+            <wp:extent cx="5943600" cy="3529263"/>
+            <wp:docPr id="15" name="Picture 15"/>
+            <wp:cNvGraphicFramePr>
+              <a:graphicFrameLocks noChangeAspect="1"/>
+            </wp:cNvGraphicFramePr>
+            <a:graphic>
+              <a:graphicData uri="http://schemas.openxmlformats.org/drawingml/2006/picture">
+                <pic:pic>
+                  <pic:nvPicPr>
+                    <pic:cNvPr id="0" name="distribution_variants_weight_initial.png"/>
+                    <pic:cNvPicPr/>
+                  </pic:nvPicPr>
+                  <pic:blipFill>
+                    <a:blip r:embed="rId22"/>
+                    <a:stretch>
+                      <a:fillRect/>
+                    </a:stretch>
+                  </pic:blipFill>
+                  <pic:spPr>
+                    <a:xfrm>
+                      <a:off x="0" y="0"/>
+                      <a:ext cx="5943600" cy="3529263"/>
+                    </a:xfrm>
+                    <a:prstGeom prst="rect"/>
+                  </pic:spPr>
+                </pic:pic>
+              </a:graphicData>
+            </a:graphic>
+          </wp:inline>
+        </w:drawing>
+      </w:r>
+    </w:p>
+    <w:p/>
+    <w:p>
+      <w:pPr>
+        <w:pStyle w:val="Heading2"/>
+      </w:pPr>
+      <w:r>
+        <w:t>3.2. Tonic Activation</w:t>
+      </w:r>
+    </w:p>
+    <w:p>
+      <w:r>
+        <w:drawing>
+          <wp:inline xmlns:a="http://schemas.openxmlformats.org/drawingml/2006/main" xmlns:pic="http://schemas.openxmlformats.org/drawingml/2006/picture">
+            <wp:extent cx="5943600" cy="3529263"/>
+            <wp:docPr id="16" name="Picture 16"/>
+            <wp:cNvGraphicFramePr>
+              <a:graphicFrameLocks noChangeAspect="1"/>
+            </wp:cNvGraphicFramePr>
+            <a:graphic>
+              <a:graphicData uri="http://schemas.openxmlformats.org/drawingml/2006/picture">
+                <pic:pic>
+                  <pic:nvPicPr>
+                    <pic:cNvPr id="0" name="distribution_0.png"/>
+                    <pic:cNvPicPr/>
+                  </pic:nvPicPr>
+                  <pic:blipFill>
+                    <a:blip r:embed="rId23"/>
+                    <a:stretch>
+                      <a:fillRect/>
+                    </a:stretch>
+                  </pic:blipFill>
+                  <pic:spPr>
+                    <a:xfrm>
+                      <a:off x="0" y="0"/>
+                      <a:ext cx="5943600" cy="3529263"/>
+                    </a:xfrm>
+                    <a:prstGeom prst="rect"/>
+                  </pic:spPr>
+                </pic:pic>
+              </a:graphicData>
+            </a:graphic>
+          </wp:inline>
+        </w:drawing>
+      </w:r>
+    </w:p>
+    <w:p/>
+    <w:p>
+      <w:pPr>
+        <w:pStyle w:val="Heading3"/>
+      </w:pPr>
+      <w:r>
+        <w:t>Distribution Comparison (Pairwise KS tests, Holm-Bonferroni corrected)</w:t>
+      </w:r>
+    </w:p>
+    <w:tbl>
+      <w:tblPr>
+        <w:tblStyle w:val="LightGrid-Accent1"/>
+        <w:tblW w:type="auto" w:w="0"/>
+        <w:tblLook w:firstColumn="1" w:firstRow="1" w:lastColumn="0" w:lastRow="0" w:noHBand="0" w:noVBand="1" w:val="04A0"/>
+      </w:tblPr>
+      <w:tblGrid>
+        <w:gridCol w:w="1440"/>
+        <w:gridCol w:w="1440"/>
+        <w:gridCol w:w="1440"/>
+        <w:gridCol w:w="1440"/>
+        <w:gridCol w:w="1440"/>
+        <w:gridCol w:w="1440"/>
+      </w:tblGrid>
+      <w:tr>
+        <w:tc>
+          <w:tcPr>
+            <w:tcW w:type="dxa" w:w="1440"/>
+          </w:tcPr>
+          <w:p>
+            <w:r>
+              <w:t>Group A</w:t>
+            </w:r>
+          </w:p>
+        </w:tc>
+        <w:tc>
+          <w:tcPr>
+            <w:tcW w:type="dxa" w:w="1440"/>
+          </w:tcPr>
+          <w:p>
+            <w:r>
+              <w:t>Group B</w:t>
+            </w:r>
+          </w:p>
+        </w:tc>
+        <w:tc>
+          <w:tcPr>
+            <w:tcW w:type="dxa" w:w="1440"/>
+          </w:tcPr>
+          <w:p>
+            <w:r>
+              <w:t>D (effect size)</w:t>
+            </w:r>
+          </w:p>
+        </w:tc>
+        <w:tc>
+          <w:tcPr>
+            <w:tcW w:type="dxa" w:w="1440"/>
+          </w:tcPr>
+          <w:p>
+            <w:r>
+              <w:t>Effect magnitude</w:t>
+            </w:r>
+          </w:p>
+        </w:tc>
+        <w:tc>
+          <w:tcPr>
+            <w:tcW w:type="dxa" w:w="1440"/>
+          </w:tcPr>
+          <w:p>
+            <w:r>
+              <w:t>p (raw)</w:t>
+            </w:r>
+          </w:p>
+        </w:tc>
+        <w:tc>
+          <w:tcPr>
+            <w:tcW w:type="dxa" w:w="1440"/>
+          </w:tcPr>
+          <w:p>
+            <w:r>
+              <w:t>p (corrected)</w:t>
+            </w:r>
+          </w:p>
+        </w:tc>
+      </w:tr>
+      <w:tr>
+        <w:tc>
+          <w:tcPr>
+            <w:tcW w:type="dxa" w:w="1440"/>
+          </w:tcPr>
+          <w:p>
+            <w:r>
+              <w:t>EA from Random</w:t>
+            </w:r>
+          </w:p>
+        </w:tc>
+        <w:tc>
+          <w:tcPr>
+            <w:tcW w:type="dxa" w:w="1440"/>
+          </w:tcPr>
+          <w:p>
+            <w:r>
+              <w:t>EA from Soft-Coded</w:t>
+            </w:r>
+          </w:p>
+        </w:tc>
+        <w:tc>
+          <w:tcPr>
+            <w:tcW w:type="dxa" w:w="1440"/>
+          </w:tcPr>
+          <w:p>
+            <w:r>
+              <w:t>0.1818</w:t>
+            </w:r>
+          </w:p>
+        </w:tc>
+        <w:tc>
+          <w:tcPr>
+            <w:tcW w:type="dxa" w:w="1440"/>
+          </w:tcPr>
+          <w:p>
+            <w:r>
+              <w:t>small</w:t>
+            </w:r>
+          </w:p>
+        </w:tc>
+        <w:tc>
+          <w:tcPr>
+            <w:tcW w:type="dxa" w:w="1440"/>
+          </w:tcPr>
+          <w:p>
+            <w:r>
+              <w:t>0.0525</w:t>
+            </w:r>
+          </w:p>
+        </w:tc>
+        <w:tc>
+          <w:tcPr>
+            <w:tcW w:type="dxa" w:w="1440"/>
+          </w:tcPr>
+          <w:p>
+            <w:r>
+              <w:t>0.0525</w:t>
+            </w:r>
+          </w:p>
+        </w:tc>
+      </w:tr>
+      <w:tr>
+        <w:tc>
+          <w:tcPr>
+            <w:tcW w:type="dxa" w:w="1440"/>
+          </w:tcPr>
+          <w:p>
+            <w:r>
+              <w:t>EA from Random</w:t>
+            </w:r>
+          </w:p>
+        </w:tc>
+        <w:tc>
+          <w:tcPr>
+            <w:tcW w:type="dxa" w:w="1440"/>
+          </w:tcPr>
+          <w:p>
+            <w:r>
+              <w:t>Soft-Coded</w:t>
+            </w:r>
+          </w:p>
+        </w:tc>
+        <w:tc>
+          <w:tcPr>
+            <w:tcW w:type="dxa" w:w="1440"/>
+          </w:tcPr>
+          <w:p>
+            <w:r>
+              <w:t>0.7636</w:t>
+            </w:r>
+          </w:p>
+        </w:tc>
+        <w:tc>
+          <w:tcPr>
+            <w:tcW w:type="dxa" w:w="1440"/>
+          </w:tcPr>
+          <w:p>
+            <w:r>
+              <w:t>large</w:t>
+            </w:r>
+          </w:p>
+        </w:tc>
+        <w:tc>
+          <w:tcPr>
+            <w:tcW w:type="dxa" w:w="1440"/>
+          </w:tcPr>
+          <w:p>
+            <w:r>
+              <w:t>2.07 × 10⁻⁶</w:t>
+            </w:r>
+          </w:p>
+        </w:tc>
+        <w:tc>
+          <w:tcPr>
+            <w:tcW w:type="dxa" w:w="1440"/>
+          </w:tcPr>
+          <w:p>
+            <w:r>
+              <w:t>4.15 × 10⁻⁶ *</w:t>
+            </w:r>
+          </w:p>
+        </w:tc>
+      </w:tr>
+      <w:tr>
+        <w:tc>
+          <w:tcPr>
+            <w:tcW w:type="dxa" w:w="1440"/>
+          </w:tcPr>
+          <w:p>
+            <w:r>
+              <w:t>EA from Soft-Coded</w:t>
+            </w:r>
+          </w:p>
+        </w:tc>
+        <w:tc>
+          <w:tcPr>
+            <w:tcW w:type="dxa" w:w="1440"/>
+          </w:tcPr>
+          <w:p>
+            <w:r>
+              <w:t>Soft-Coded</w:t>
+            </w:r>
+          </w:p>
+        </w:tc>
+        <w:tc>
+          <w:tcPr>
+            <w:tcW w:type="dxa" w:w="1440"/>
+          </w:tcPr>
+          <w:p>
+            <w:r>
+              <w:t>0.8091</w:t>
+            </w:r>
+          </w:p>
+        </w:tc>
+        <w:tc>
+          <w:tcPr>
+            <w:tcW w:type="dxa" w:w="1440"/>
+          </w:tcPr>
+          <w:p>
+            <w:r>
+              <w:t>large</w:t>
+            </w:r>
+          </w:p>
+        </w:tc>
+        <w:tc>
+          <w:tcPr>
+            <w:tcW w:type="dxa" w:w="1440"/>
+          </w:tcPr>
+          <w:p>
+            <w:r>
+              <w:t>2.51 × 10⁻⁷</w:t>
+            </w:r>
+          </w:p>
+        </w:tc>
+        <w:tc>
+          <w:tcPr>
+            <w:tcW w:type="dxa" w:w="1440"/>
+          </w:tcPr>
+          <w:p>
+            <w:r>
+              <w:t>7.54 × 10⁻⁷ *</w:t>
+            </w:r>
+          </w:p>
+        </w:tc>
+      </w:tr>
+    </w:tbl>
+    <w:p/>
+    <w:p>
+      <w:pPr>
+        <w:pStyle w:val="Heading3"/>
+      </w:pPr>
+      <w:r>
+        <w:t>Per-Variant Distributions</w:t>
+      </w:r>
+    </w:p>
+    <w:p>
+      <w:r>
+        <w:drawing>
+          <wp:inline xmlns:a="http://schemas.openxmlformats.org/drawingml/2006/main" xmlns:pic="http://schemas.openxmlformats.org/drawingml/2006/picture">
+            <wp:extent cx="5943600" cy="3529263"/>
+            <wp:docPr id="17" name="Picture 17"/>
+            <wp:cNvGraphicFramePr>
+              <a:graphicFrameLocks noChangeAspect="1"/>
+            </wp:cNvGraphicFramePr>
+            <a:graphic>
+              <a:graphicData uri="http://schemas.openxmlformats.org/drawingml/2006/picture">
+                <pic:pic>
+                  <pic:nvPicPr>
+                    <pic:cNvPr id="0" name="distribution_variants_0.png"/>
+                    <pic:cNvPicPr/>
+                  </pic:nvPicPr>
+                  <pic:blipFill>
+                    <a:blip r:embed="rId24"/>
+                    <a:stretch>
+                      <a:fillRect/>
+                    </a:stretch>
+                  </pic:blipFill>
+                  <pic:spPr>
+                    <a:xfrm>
+                      <a:off x="0" y="0"/>
+                      <a:ext cx="5943600" cy="3529263"/>
+                    </a:xfrm>
+                    <a:prstGeom prst="rect"/>
+                  </pic:spPr>
+                </pic:pic>
+              </a:graphicData>
+            </a:graphic>
+          </wp:inline>
+        </w:drawing>
+      </w:r>
+    </w:p>
+    <w:p/>
+    <w:p>
+      <w:pPr>
+        <w:pStyle w:val="Heading2"/>
+      </w:pPr>
+      <w:r>
+        <w:t>3.3. Plasticity</w:t>
+      </w:r>
+    </w:p>
+    <w:p>
+      <w:r>
+        <w:drawing>
+          <wp:inline xmlns:a="http://schemas.openxmlformats.org/drawingml/2006/main" xmlns:pic="http://schemas.openxmlformats.org/drawingml/2006/picture">
+            <wp:extent cx="5943600" cy="3529263"/>
+            <wp:docPr id="18" name="Picture 18"/>
+            <wp:cNvGraphicFramePr>
+              <a:graphicFrameLocks noChangeAspect="1"/>
+            </wp:cNvGraphicFramePr>
+            <a:graphic>
+              <a:graphicData uri="http://schemas.openxmlformats.org/drawingml/2006/picture">
+                <pic:pic>
+                  <pic:nvPicPr>
+                    <pic:cNvPr id="0" name="distribution_modulation_weight.png"/>
+                    <pic:cNvPicPr/>
+                  </pic:nvPicPr>
+                  <pic:blipFill>
+                    <a:blip r:embed="rId25"/>
+                    <a:stretch>
+                      <a:fillRect/>
+                    </a:stretch>
+                  </pic:blipFill>
+                  <pic:spPr>
+                    <a:xfrm>
+                      <a:off x="0" y="0"/>
+                      <a:ext cx="5943600" cy="3529263"/>
+                    </a:xfrm>
+                    <a:prstGeom prst="rect"/>
+                  </pic:spPr>
+                </pic:pic>
+              </a:graphicData>
+            </a:graphic>
+          </wp:inline>
+        </w:drawing>
+      </w:r>
+    </w:p>
+    <w:p/>
+    <w:p>
+      <w:pPr>
+        <w:pStyle w:val="Heading3"/>
+      </w:pPr>
+      <w:r>
+        <w:t>Distribution Comparison (Pairwise KS tests, Holm-Bonferroni corrected)</w:t>
+      </w:r>
+    </w:p>
+    <w:tbl>
+      <w:tblPr>
+        <w:tblStyle w:val="LightGrid-Accent1"/>
+        <w:tblW w:type="auto" w:w="0"/>
+        <w:tblLook w:firstColumn="1" w:firstRow="1" w:lastColumn="0" w:lastRow="0" w:noHBand="0" w:noVBand="1" w:val="04A0"/>
+      </w:tblPr>
+      <w:tblGrid>
+        <w:gridCol w:w="1440"/>
+        <w:gridCol w:w="1440"/>
+        <w:gridCol w:w="1440"/>
+        <w:gridCol w:w="1440"/>
+        <w:gridCol w:w="1440"/>
+        <w:gridCol w:w="1440"/>
+      </w:tblGrid>
+      <w:tr>
+        <w:tc>
+          <w:tcPr>
+            <w:tcW w:type="dxa" w:w="1440"/>
+          </w:tcPr>
+          <w:p>
+            <w:r>
+              <w:t>Group A</w:t>
+            </w:r>
+          </w:p>
+        </w:tc>
+        <w:tc>
+          <w:tcPr>
+            <w:tcW w:type="dxa" w:w="1440"/>
+          </w:tcPr>
+          <w:p>
+            <w:r>
+              <w:t>Group B</w:t>
+            </w:r>
+          </w:p>
+        </w:tc>
+        <w:tc>
+          <w:tcPr>
+            <w:tcW w:type="dxa" w:w="1440"/>
+          </w:tcPr>
+          <w:p>
+            <w:r>
+              <w:t>D (effect size)</w:t>
+            </w:r>
+          </w:p>
+        </w:tc>
+        <w:tc>
+          <w:tcPr>
+            <w:tcW w:type="dxa" w:w="1440"/>
+          </w:tcPr>
+          <w:p>
+            <w:r>
+              <w:t>Effect magnitude</w:t>
+            </w:r>
+          </w:p>
+        </w:tc>
+        <w:tc>
+          <w:tcPr>
+            <w:tcW w:type="dxa" w:w="1440"/>
+          </w:tcPr>
+          <w:p>
+            <w:r>
+              <w:t>p (raw)</w:t>
+            </w:r>
+          </w:p>
+        </w:tc>
+        <w:tc>
+          <w:tcPr>
+            <w:tcW w:type="dxa" w:w="1440"/>
+          </w:tcPr>
+          <w:p>
+            <w:r>
+              <w:t>p (corrected)</w:t>
+            </w:r>
+          </w:p>
+        </w:tc>
+      </w:tr>
+      <w:tr>
+        <w:tc>
+          <w:tcPr>
+            <w:tcW w:type="dxa" w:w="1440"/>
+          </w:tcPr>
+          <w:p>
+            <w:r>
+              <w:t>EA from Random</w:t>
+            </w:r>
+          </w:p>
+        </w:tc>
+        <w:tc>
+          <w:tcPr>
+            <w:tcW w:type="dxa" w:w="1440"/>
+          </w:tcPr>
+          <w:p>
+            <w:r>
+              <w:t>EA from Soft-Coded</w:t>
+            </w:r>
+          </w:p>
+        </w:tc>
+        <w:tc>
+          <w:tcPr>
+            <w:tcW w:type="dxa" w:w="1440"/>
+          </w:tcPr>
+          <w:p>
+            <w:r>
+              <w:t>0.5868</w:t>
+            </w:r>
+          </w:p>
+        </w:tc>
+        <w:tc>
+          <w:tcPr>
+            <w:tcW w:type="dxa" w:w="1440"/>
+          </w:tcPr>
+          <w:p>
+            <w:r>
+              <w:t>large</w:t>
+            </w:r>
+          </w:p>
+        </w:tc>
+        <w:tc>
+          <w:tcPr>
+            <w:tcW w:type="dxa" w:w="1440"/>
+          </w:tcPr>
+          <w:p>
+            <w:r>
+              <w:t>3.92 × 10⁻³⁰</w:t>
+            </w:r>
+          </w:p>
+        </w:tc>
+        <w:tc>
+          <w:tcPr>
+            <w:tcW w:type="dxa" w:w="1440"/>
+          </w:tcPr>
+          <w:p>
+            <w:r>
+              <w:t>1.18 × 10⁻²⁹ *</w:t>
+            </w:r>
+          </w:p>
+        </w:tc>
+      </w:tr>
+      <w:tr>
+        <w:tc>
+          <w:tcPr>
+            <w:tcW w:type="dxa" w:w="1440"/>
+          </w:tcPr>
+          <w:p>
+            <w:r>
+              <w:t>EA from Random</w:t>
+            </w:r>
+          </w:p>
+        </w:tc>
+        <w:tc>
+          <w:tcPr>
+            <w:tcW w:type="dxa" w:w="1440"/>
+          </w:tcPr>
+          <w:p>
+            <w:r>
+              <w:t>Soft-Coded</w:t>
+            </w:r>
+          </w:p>
+        </w:tc>
+        <w:tc>
+          <w:tcPr>
+            <w:tcW w:type="dxa" w:w="1440"/>
+          </w:tcPr>
+          <w:p>
+            <w:r>
+              <w:t>0.9988</w:t>
+            </w:r>
+          </w:p>
+        </w:tc>
+        <w:tc>
+          <w:tcPr>
+            <w:tcW w:type="dxa" w:w="1440"/>
+          </w:tcPr>
+          <w:p>
+            <w:r>
+              <w:t>large</w:t>
+            </w:r>
+          </w:p>
+        </w:tc>
+        <w:tc>
+          <w:tcPr>
+            <w:tcW w:type="dxa" w:w="1440"/>
+          </w:tcPr>
+          <w:p>
+            <w:r>
+              <w:t>6.58 × 10⁻²⁶</w:t>
+            </w:r>
+          </w:p>
+        </w:tc>
+        <w:tc>
+          <w:tcPr>
+            <w:tcW w:type="dxa" w:w="1440"/>
+          </w:tcPr>
+          <w:p>
+            <w:r>
+              <w:t>1.32 × 10⁻²⁵ *</w:t>
+            </w:r>
+          </w:p>
+        </w:tc>
+      </w:tr>
+      <w:tr>
+        <w:tc>
+          <w:tcPr>
+            <w:tcW w:type="dxa" w:w="1440"/>
+          </w:tcPr>
+          <w:p>
+            <w:r>
+              <w:t>EA from Soft-Coded</w:t>
+            </w:r>
+          </w:p>
+        </w:tc>
+        <w:tc>
+          <w:tcPr>
+            <w:tcW w:type="dxa" w:w="1440"/>
+          </w:tcPr>
+          <w:p>
+            <w:r>
+              <w:t>Soft-Coded</w:t>
+            </w:r>
+          </w:p>
+        </w:tc>
+        <w:tc>
+          <w:tcPr>
+            <w:tcW w:type="dxa" w:w="1440"/>
+          </w:tcPr>
+          <w:p>
+            <w:r>
+              <w:t>0.5980</w:t>
+            </w:r>
+          </w:p>
+        </w:tc>
+        <w:tc>
+          <w:tcPr>
+            <w:tcW w:type="dxa" w:w="1440"/>
+          </w:tcPr>
+          <w:p>
+            <w:r>
+              <w:t>large</w:t>
+            </w:r>
+          </w:p>
+        </w:tc>
+        <w:tc>
+          <w:tcPr>
+            <w:tcW w:type="dxa" w:w="1440"/>
+          </w:tcPr>
+          <w:p>
+            <w:r>
+              <w:t>3.82 × 10⁻⁴</w:t>
+            </w:r>
+          </w:p>
+        </w:tc>
+        <w:tc>
+          <w:tcPr>
+            <w:tcW w:type="dxa" w:w="1440"/>
+          </w:tcPr>
+          <w:p>
+            <w:r>
+              <w:t>3.82 × 10⁻⁴ *</w:t>
+            </w:r>
+          </w:p>
+        </w:tc>
+      </w:tr>
+    </w:tbl>
+    <w:p/>
+    <w:p>
+      <w:pPr>
+        <w:pStyle w:val="Heading3"/>
+      </w:pPr>
+      <w:r>
+        <w:t>Per-Variant Distributions</w:t>
+      </w:r>
+    </w:p>
+    <w:p>
+      <w:r>
+        <w:drawing>
+          <wp:inline xmlns:a="http://schemas.openxmlformats.org/drawingml/2006/main" xmlns:pic="http://schemas.openxmlformats.org/drawingml/2006/picture">
+            <wp:extent cx="5943600" cy="3529263"/>
+            <wp:docPr id="19" name="Picture 19"/>
+            <wp:cNvGraphicFramePr>
+              <a:graphicFrameLocks noChangeAspect="1"/>
+            </wp:cNvGraphicFramePr>
+            <a:graphic>
+              <a:graphicData uri="http://schemas.openxmlformats.org/drawingml/2006/picture">
+                <pic:pic>
+                  <pic:nvPicPr>
+                    <pic:cNvPr id="0" name="distribution_variants_modulation_weight.png"/>
+                    <pic:cNvPicPr/>
+                  </pic:nvPicPr>
+                  <pic:blipFill>
+                    <a:blip r:embed="rId26"/>
+                    <a:stretch>
+                      <a:fillRect/>
+                    </a:stretch>
+                  </pic:blipFill>
+                  <pic:spPr>
+                    <a:xfrm>
+                      <a:off x="0" y="0"/>
+                      <a:ext cx="5943600" cy="3529263"/>
+                    </a:xfrm>
+                    <a:prstGeom prst="rect"/>
+                  </pic:spPr>
+                </pic:pic>
+              </a:graphicData>
+            </a:graphic>
+          </wp:inline>
+        </w:drawing>
+      </w:r>
+    </w:p>
+    <w:p/>
+    <w:p>
+      <w:r>
+        <w:drawing>
+          <wp:inline xmlns:a="http://schemas.openxmlformats.org/drawingml/2006/main" xmlns:pic="http://schemas.openxmlformats.org/drawingml/2006/picture">
+            <wp:extent cx="5943600" cy="3550096"/>
+            <wp:docPr id="20" name="Picture 20"/>
+            <wp:cNvGraphicFramePr>
+              <a:graphicFrameLocks noChangeAspect="1"/>
+            </wp:cNvGraphicFramePr>
+            <a:graphic>
+              <a:graphicData uri="http://schemas.openxmlformats.org/drawingml/2006/picture">
+                <pic:pic>
+                  <pic:nvPicPr>
+                    <pic:cNvPr id="0" name="per_variant_eta.png"/>
+                    <pic:cNvPicPr/>
+                  </pic:nvPicPr>
+                  <pic:blipFill>
+                    <a:blip r:embed="rId27"/>
+                    <a:stretch>
+                      <a:fillRect/>
+                    </a:stretch>
+                  </pic:blipFill>
+                  <pic:spPr>
+                    <a:xfrm>
+                      <a:off x="0" y="0"/>
+                      <a:ext cx="5943600" cy="3550096"/>
+                    </a:xfrm>
+                    <a:prstGeom prst="rect"/>
+                  </pic:spPr>
+                </pic:pic>
+              </a:graphicData>
+            </a:graphic>
+          </wp:inline>
+        </w:drawing>
+      </w:r>
+    </w:p>
+    <w:p/>
+    <w:p>
+      <w:pPr>
+        <w:pStyle w:val="Heading3"/>
+      </w:pPr>
+      <w:r>
+        <w:t>Statistical Comparison of Learning rate eta</w:t>
+      </w:r>
+    </w:p>
+    <w:p>
+      <w:r>
+        <w:t>Kruskal-Wallis: p = 3.63 × 10⁻⁴, Ordinal Epsilon-squared ε²R = 0.7691</w:t>
+      </w:r>
+    </w:p>
+    <w:p>
+      <w:pPr>
+        <w:pStyle w:val="Heading4"/>
+      </w:pPr>
+      <w:r>
+        <w:t>Pairwise Comparisons (Holm-Bonferroni corrected)</w:t>
+      </w:r>
+    </w:p>
+    <w:tbl>
+      <w:tblPr>
+        <w:tblStyle w:val="LightGrid-Accent1"/>
+        <w:tblW w:type="auto" w:w="0"/>
+        <w:tblLook w:firstColumn="1" w:firstRow="1" w:lastColumn="0" w:lastRow="0" w:noHBand="0" w:noVBand="1" w:val="04A0"/>
+      </w:tblPr>
+      <w:tblGrid>
+        <w:gridCol w:w="1728"/>
+        <w:gridCol w:w="1728"/>
+        <w:gridCol w:w="1728"/>
+        <w:gridCol w:w="1728"/>
+        <w:gridCol w:w="1728"/>
+      </w:tblGrid>
+      <w:tr>
+        <w:tc>
+          <w:tcPr>
+            <w:tcW w:type="dxa" w:w="1728"/>
+          </w:tcPr>
+          <w:p>
+            <w:r>
+              <w:t>Group A</w:t>
+            </w:r>
+          </w:p>
+        </w:tc>
+        <w:tc>
+          <w:tcPr>
+            <w:tcW w:type="dxa" w:w="1728"/>
+          </w:tcPr>
+          <w:p>
+            <w:r>
+              <w:t>Group B</w:t>
+            </w:r>
+          </w:p>
+        </w:tc>
+        <w:tc>
+          <w:tcPr>
+            <w:tcW w:type="dxa" w:w="1728"/>
+          </w:tcPr>
+          <w:p>
+            <w:r>
+              <w:t>Rank-Biserial r</w:t>
+            </w:r>
+          </w:p>
+        </w:tc>
+        <w:tc>
+          <w:tcPr>
+            <w:tcW w:type="dxa" w:w="1728"/>
+          </w:tcPr>
+          <w:p>
+            <w:r>
+              <w:t>p (raw)</w:t>
+            </w:r>
+          </w:p>
+        </w:tc>
+        <w:tc>
+          <w:tcPr>
+            <w:tcW w:type="dxa" w:w="1728"/>
+          </w:tcPr>
+          <w:p>
+            <w:r>
+              <w:t>p (corrected)</w:t>
+            </w:r>
+          </w:p>
+        </w:tc>
+      </w:tr>
+      <w:tr>
+        <w:tc>
+          <w:tcPr>
+            <w:tcW w:type="dxa" w:w="1728"/>
+          </w:tcPr>
+          <w:p>
+            <w:r>
+              <w:t>EA from Random</w:t>
+            </w:r>
+          </w:p>
+        </w:tc>
+        <w:tc>
+          <w:tcPr>
+            <w:tcW w:type="dxa" w:w="1728"/>
+          </w:tcPr>
+          <w:p>
+            <w:r>
+              <w:t>EA from Soft-Coded</w:t>
+            </w:r>
+          </w:p>
+        </w:tc>
+        <w:tc>
+          <w:tcPr>
+            <w:tcW w:type="dxa" w:w="1728"/>
+          </w:tcPr>
+          <w:p>
+            <w:r>
+              <w:t>-1.0000</w:t>
+            </w:r>
+          </w:p>
+        </w:tc>
+        <w:tc>
+          <w:tcPr>
+            <w:tcW w:type="dxa" w:w="1728"/>
+          </w:tcPr>
+          <w:p>
+            <w:r>
+              <w:t>1.31 × 10⁻⁴</w:t>
+            </w:r>
+          </w:p>
+        </w:tc>
+        <w:tc>
+          <w:tcPr>
+            <w:tcW w:type="dxa" w:w="1728"/>
+          </w:tcPr>
+          <w:p>
+            <w:r>
+              <w:t>3.93 × 10⁻⁴ *</w:t>
+            </w:r>
+          </w:p>
+        </w:tc>
+      </w:tr>
+      <w:tr>
+        <w:tc>
+          <w:tcPr>
+            <w:tcW w:type="dxa" w:w="1728"/>
+          </w:tcPr>
+          <w:p>
+            <w:r>
+              <w:t>EA from Random</w:t>
+            </w:r>
+          </w:p>
+        </w:tc>
+        <w:tc>
+          <w:tcPr>
+            <w:tcW w:type="dxa" w:w="1728"/>
+          </w:tcPr>
+          <w:p>
+            <w:r>
+              <w:t>Soft-Coded</w:t>
+            </w:r>
+          </w:p>
+        </w:tc>
+        <w:tc>
+          <w:tcPr>
+            <w:tcW w:type="dxa" w:w="1728"/>
+          </w:tcPr>
+          <w:p>
+            <w:r>
+              <w:t>-1.0000</w:t>
+            </w:r>
+          </w:p>
+        </w:tc>
+        <w:tc>
+          <w:tcPr>
+            <w:tcW w:type="dxa" w:w="1728"/>
+          </w:tcPr>
+          <w:p>
+            <w:r>
+              <w:t>0.0993</w:t>
+            </w:r>
+          </w:p>
+        </w:tc>
+        <w:tc>
+          <w:tcPr>
+            <w:tcW w:type="dxa" w:w="1728"/>
+          </w:tcPr>
+          <w:p>
+            <w:r>
+              <w:t>0.1986</w:t>
+            </w:r>
+          </w:p>
+        </w:tc>
+      </w:tr>
+      <w:tr>
+        <w:tc>
+          <w:tcPr>
+            <w:tcW w:type="dxa" w:w="1728"/>
+          </w:tcPr>
+          <w:p>
+            <w:r>
+              <w:t>EA from Soft-Coded</w:t>
+            </w:r>
+          </w:p>
+        </w:tc>
+        <w:tc>
+          <w:tcPr>
+            <w:tcW w:type="dxa" w:w="1728"/>
+          </w:tcPr>
+          <w:p>
+            <w:r>
+              <w:t>Soft-Coded</w:t>
+            </w:r>
+          </w:p>
+        </w:tc>
+        <w:tc>
+          <w:tcPr>
+            <w:tcW w:type="dxa" w:w="1728"/>
+          </w:tcPr>
+          <w:p>
+            <w:r>
+              <w:t>-0.6000</w:t>
+            </w:r>
+          </w:p>
+        </w:tc>
+        <w:tc>
+          <w:tcPr>
+            <w:tcW w:type="dxa" w:w="1728"/>
+          </w:tcPr>
+          <w:p>
+            <w:r>
+              <w:t>0.4281</w:t>
+            </w:r>
+          </w:p>
+        </w:tc>
+        <w:tc>
+          <w:tcPr>
+            <w:tcW w:type="dxa" w:w="1728"/>
+          </w:tcPr>
+          <w:p>
+            <w:r>
+              <w:t>0.4281</w:t>
+            </w:r>
+          </w:p>
+        </w:tc>
+      </w:tr>
+    </w:tbl>
     <w:p/>
     <w:sectPr>
       <w:pgSz w:w="12240" w:h="15840"/>

</xml_diff>